<commit_message>
feat(astrova): refine heritage visit intelligence
- complete accessibility and responsive verification
- refine visitor intelligence UI
- improve open-data integration
- maintain trusted source attribution
- improve error and provider handling
- update regression tests
- update technical documentation

🤖 Generated with Codebuff
Co-Authored-By: Codebuff <noreply@codebuff.com>
</commit_message>
<xml_diff>
--- a/docs/HERITAGE-VISIT-INTELLIGENCE-IMPLEMENTATION-REPORT.docx
+++ b/docs/HERITAGE-VISIT-INTELLIGENCE-IMPLEMENTATION-REPORT.docx
@@ -1339,6 +1339,72 @@
           </w:tcPr>
           <w:p>
             <w:r>
+              <w:t>Final pass: responsive (5 pages × 10 real viewports)</w:t>
+            </w:r>
+          </w:p>
+        </w:tc>
+        <w:tc>
+          <w:tcPr>
+            <w:tcW w:type="dxa" w:w="4320"/>
+          </w:tcPr>
+          <w:p>
+            <w:r>
+              <w:t>PASS — 50/50, zero horizontal overflow</w:t>
+            </w:r>
+          </w:p>
+        </w:tc>
+      </w:tr>
+      <w:tr>
+        <w:tc>
+          <w:tcPr>
+            <w:tcW w:type="dxa" w:w="4320"/>
+          </w:tcPr>
+          <w:p>
+            <w:r>
+              <w:t>Final pass: accessibility audit + fixes</w:t>
+            </w:r>
+          </w:p>
+        </w:tc>
+        <w:tc>
+          <w:tcPr>
+            <w:tcW w:type="dxa" w:w="4320"/>
+          </w:tcPr>
+          <w:p>
+            <w:r>
+              <w:t>PASS — 0 heading skips / unnamed controls / unlabeled inputs; footer h2 fix; focus outline + touch-target spacing verified</w:t>
+            </w:r>
+          </w:p>
+        </w:tc>
+      </w:tr>
+      <w:tr>
+        <w:tc>
+          <w:tcPr>
+            <w:tcW w:type="dxa" w:w="4320"/>
+          </w:tcPr>
+          <w:p>
+            <w:r>
+              <w:t>Final pass: user flow (16 steps) + error matrix (15 cases)</w:t>
+            </w:r>
+          </w:p>
+        </w:tc>
+        <w:tc>
+          <w:tcPr>
+            <w:tcW w:type="dxa" w:w="4320"/>
+          </w:tcPr>
+          <w:p>
+            <w:r>
+              <w:t>PASS — incl. live 429 → role=alert + Retry, empty-nearby honesty, traversal 404</w:t>
+            </w:r>
+          </w:p>
+        </w:tc>
+      </w:tr>
+      <w:tr>
+        <w:tc>
+          <w:tcPr>
+            <w:tcW w:type="dxa" w:w="4320"/>
+          </w:tcPr>
+          <w:p>
+            <w:r>
               <w:t>Failure states (backend down, 429, provider fail, 404, junk input)</w:t>
             </w:r>
           </w:p>
@@ -1492,6 +1558,22 @@
       </w:pPr>
       <w:r>
         <w:t>In-memory caches/limits are single-server; admin full login not re-verified (no credentials available).</w:t>
+      </w:r>
+    </w:p>
+    <w:p>
+      <w:pPr>
+        <w:pStyle w:val="ListBullet"/>
+      </w:pPr>
+      <w:r>
+        <w:t>22 migration-030 entities have NULL slugs (UUID fallback links; no unreviewed slug backfill).</w:t>
+      </w:r>
+    </w:p>
+    <w:p>
+      <w:pPr>
+        <w:pStyle w:val="ListBullet"/>
+      </w:pPr>
+      <w:r>
+        <w:t>Overpass cold latency varies (9-10 s typical; 13-30 s observed in final verification; failed attempts never cached).</w:t>
       </w:r>
     </w:p>
     <w:p>
@@ -1683,7 +1765,7 @@
           </w:tcPr>
           <w:p>
             <w:r>
-              <w:t>PASS (second session: 10/10 + 4/4 + 16/16 + 34/34; tsc/eslint/builds green)</w:t>
+              <w:t>PASS (10/10 + 4/4 + 16/16 + 34/34; final pass re-verified flow, error matrix, a11y, responsive)</w:t>
             </w:r>
           </w:p>
         </w:tc>

</xml_diff>